<commit_message>
Refresh reframe_draft.md and its docx with the corrected S and kappa view (thermal limits, Table 11 ranks, Spearman 0.06 and 0.45, limits researched only for the shortlist)
Co-Authored-By: Claude Sonnet 5.5 <noreply@anthropic.com>
</commit_message>
<xml_diff>
--- a/thesis_paper/docs/reframe_draft.docx
+++ b/thesis_paper/docs/reframe_draft.docx
@@ -1690,25 +1690,22 @@
           <w:b/>
           <w:bCs/>
         </w:rPr>
-        <w:t xml:space="preserve">What it would be (design, fixed before it is built).</w:t>
-      </w:r>
-      <w:r>
-        <w:t xml:space="preserve"> </w:t>
-      </w:r>
-      <w:r>
-        <w:t xml:space="preserve">Using only the committed predictions (</w:t>
+        <w:t xml:space="preserve">What it is (design, fixed before the script was run).</w:t>
+      </w:r>
+      <w:r>
+        <w:t xml:space="preserve"> </w:t>
+      </w:r>
+      <w:r>
+        <w:t xml:space="preserve">Using only committed files (</w:t>
       </w:r>
       <w:r>
         <w:rPr>
           <w:rStyle w:val="VerbatimChar"/>
         </w:rPr>
-        <w:t xml:space="preserve">results/na11_ranked/20261005T053426/ranked_all_409.csv</w:t>
-      </w:r>
-      <w:r>
-        <w:t xml:space="preserve"> </w:t>
-      </w:r>
-      <w:r>
-        <w:t xml:space="preserve">and</w:t>
+        <w:t xml:space="preserve">results/na11_ranked/20261005T053426/</w:t>
+      </w:r>
+      <w:r>
+        <w:t xml:space="preserve">, the per-temperature predictions behind it and the thermal limits of Table 11b,</w:t>
       </w:r>
       <w:r>
         <w:t xml:space="preserve"> </w:t>
@@ -1717,23 +1714,10 @@
         <w:rPr>
           <w:rStyle w:val="VerbatimChar"/>
         </w:rPr>
-        <w:t xml:space="preserve">ranked_main_30.csv</w:t>
-      </w:r>
-      <w:r>
-        <w:t xml:space="preserve">: the values of S,</w:t>
-      </w:r>
-      <w:r>
-        <w:t xml:space="preserve"> </w:t>
-      </w:r>
-      <w:r>
-        <w:rPr>
-          <w:i/>
-          <w:iCs/>
-        </w:rPr>
-        <w:t xml:space="preserve">σ</w:t>
-      </w:r>
-      <w:r>
-        <w:t xml:space="preserve">,</w:t>
+        <w:t xml:space="preserve">docs/shortlist_thermal_limits.csv</w:t>
+      </w:r>
+      <w:r>
+        <w:t xml:space="preserve">): (a) a two-dimensional figure of |S| against</w:t>
       </w:r>
       <w:r>
         <w:t xml:space="preserve"> </w:t>
@@ -1749,13 +1733,19 @@
         <w:t xml:space="preserve"> </w:t>
       </w:r>
       <w:r>
-        <w:t xml:space="preserve">and zT at the temperature of the predicted maximum of zT, which is 800 K for</w:t>
-      </w:r>
-      <w:r>
-        <w:t xml:space="preserve"> </w:t>
-      </w:r>
-      <w:r>
-        <w:t xml:space="preserve">every one of the 30 main-list candidates and for 406 of the 409): (a) a two-dimensional figure of |S| against</w:t>
+        <w:t xml:space="preserve">for the</w:t>
+      </w:r>
+      <w:r>
+        <w:t xml:space="preserve"> </w:t>
+      </w:r>
+      <w:r>
+        <w:t xml:space="preserve">30</w:t>
+      </w:r>
+      <w:r>
+        <w:t xml:space="preserve"> </w:t>
+      </w:r>
+      <w:r>
+        <w:t xml:space="preserve">main-list candidates, seen and unseen clusters marked, with the position # of Table 11 written beside each point; (b) Table 11c, with each candidate’s zT rank (the position # of Table 11, the rank within its cluster group), its rank by |S| and its rank by</w:t>
       </w:r>
       <w:r>
         <w:t xml:space="preserve"> </w:t>
@@ -1771,13 +1761,7 @@
         <w:t xml:space="preserve"> </w:t>
       </w:r>
       <w:r>
-        <w:t xml:space="preserve">for the 30 candidates, seen and unseen clusters marked, the zT rank written beside each point; (b) one table, Table 11c, with each candidate’s zT rank,</w:t>
-      </w:r>
-      <w:r>
-        <w:t xml:space="preserve"> </w:t>
-      </w:r>
-      <w:r>
-        <w:t xml:space="preserve">its rank by |S| and its rank by</w:t>
+        <w:t xml:space="preserve">(low is better), ordered by the sum of the last two; (c) no combined score and no new threshold. S and</w:t>
       </w:r>
       <w:r>
         <w:t xml:space="preserve"> </w:t>
@@ -1793,22 +1777,121 @@
         <w:t xml:space="preserve"> </w:t>
       </w:r>
       <w:r>
-        <w:t xml:space="preserve">(low is better), seen or unseen, and the sign override of S where it applies; (c) no combined score and no new threshold: the two orderings are shown, not merged. Nothing is refitted and no new prediction is made. It would be labelled</w:t>
-      </w:r>
-      <w:r>
-        <w:t xml:space="preserve"> </w:t>
-      </w:r>
-      <w:r>
-        <w:t xml:space="preserve">“added</w:t>
-      </w:r>
-      <w:r>
-        <w:t xml:space="preserve"> </w:t>
-      </w:r>
-      <w:r>
-        <w:t xml:space="preserve">after the literature comparison, not pre-registered”</w:t>
-      </w:r>
-      <w:r>
-        <w:t xml:space="preserve">, the pre-registered shortlist and its rule would stay as they are, and every number in it would be generated by a script from the committed files.</w:t>
+        <w:t xml:space="preserve">are taken at the grid temperature of the maximum predicted zT within each compound’s thermal limit: CsSnI</w:t>
+      </w:r>
+      <w:r>
+        <w:rPr>
+          <w:vertAlign w:val="subscript"/>
+        </w:rPr>
+        <w:t xml:space="preserve">3</w:t>
+      </w:r>
+      <w:r>
+        <w:t xml:space="preserve"> </w:t>
+      </w:r>
+      <w:r>
+        <w:t xml:space="preserve">(melting at 724 K;</w:t>
+      </w:r>
+      <w:r>
+        <w:t xml:space="preserve"> </w:t>
+      </w:r>
+      <w:r>
+        <w:t xml:space="preserve">2</w:t>
+      </w:r>
+      <w:r>
+        <w:t xml:space="preserve"> </w:t>
+      </w:r>
+      <w:r>
+        <w:t xml:space="preserve">of the</w:t>
+      </w:r>
+      <w:r>
+        <w:t xml:space="preserve"> </w:t>
+      </w:r>
+      <w:r>
+        <w:t xml:space="preserve">30</w:t>
+      </w:r>
+      <w:r>
+        <w:t xml:space="preserve"> </w:t>
+      </w:r>
+      <w:r>
+        <w:t xml:space="preserve">entries) is limited to</w:t>
+      </w:r>
+      <w:r>
+        <w:t xml:space="preserve"> </w:t>
+      </w:r>
+      <w:r>
+        <w:t xml:space="preserve">700</w:t>
+      </w:r>
+      <w:r>
+        <w:t xml:space="preserve"> </w:t>
+      </w:r>
+      <w:r>
+        <w:t xml:space="preserve">K, the other</w:t>
+      </w:r>
+      <w:r>
+        <w:t xml:space="preserve"> </w:t>
+      </w:r>
+      <w:r>
+        <w:t xml:space="preserve">28</w:t>
+      </w:r>
+      <w:r>
+        <w:t xml:space="preserve"> </w:t>
+      </w:r>
+      <w:r>
+        <w:t xml:space="preserve">use</w:t>
+      </w:r>
+      <w:r>
+        <w:t xml:space="preserve"> </w:t>
+      </w:r>
+      <w:r>
+        <w:t xml:space="preserve">800</w:t>
+      </w:r>
+      <w:r>
+        <w:t xml:space="preserve"> </w:t>
+      </w:r>
+      <w:r>
+        <w:t xml:space="preserve">K, and LaCoO</w:t>
+      </w:r>
+      <w:r>
+        <w:rPr>
+          <w:vertAlign w:val="subscript"/>
+        </w:rPr>
+        <w:t xml:space="preserve">3</w:t>
+      </w:r>
+      <w:r>
+        <w:t xml:space="preserve">’s conditional limit (reducing atmosphere) is flagged, not applied, as in Table 11b. Limits were researched only for the shortlist, so no other compound has one applied; this is a stated gap. Nothing is refitted and no new prediction is made. It is labelled</w:t>
+      </w:r>
+      <w:r>
+        <w:t xml:space="preserve"> </w:t>
+      </w:r>
+      <w:r>
+        <w:t xml:space="preserve">“added after the literature comparison, not pre-registered”</w:t>
+      </w:r>
+      <w:r>
+        <w:t xml:space="preserve">, the pre-registered shortlist and its rule are unchanged, and every number is generated by a script from the committed files. (A first run took 800 K for all 30 candidates, although CsSnI</w:t>
+      </w:r>
+      <w:r>
+        <w:rPr>
+          <w:vertAlign w:val="subscript"/>
+        </w:rPr>
+        <w:t xml:space="preserve">3</w:t>
+      </w:r>
+      <w:r>
+        <w:t xml:space="preserve"> </w:t>
+      </w:r>
+      <w:r>
+        <w:t xml:space="preserve">is limited and sits at positions 1 and 2 of Table 11c; it was corrected the same day and is recorded in</w:t>
+      </w:r>
+      <w:r>
+        <w:t xml:space="preserve"> </w:t>
+      </w:r>
+      <w:r>
+        <w:rPr>
+          <w:rStyle w:val="VerbatimChar"/>
+        </w:rPr>
+        <w:t xml:space="preserve">docs/decisions.md</w:t>
+      </w:r>
+      <w:r>
+        <w:t xml:space="preserve">.)</w:t>
       </w:r>
     </w:p>
     <w:p>
@@ -1842,7 +1925,7 @@
           <w:b/>
           <w:bCs/>
         </w:rPr>
-        <w:t xml:space="preserve">, results/screening_s_kappa/20261020T042641, clean tree; added after NA12, not pre-registered).</w:t>
+        <w:t xml:space="preserve">, results/screening_s_kappa/20261020T053227, clean tree; added after NA12, not pre-registered).</w:t>
       </w:r>
       <w:r>
         <w:t xml:space="preserve"> </w:t>
@@ -1857,13 +1940,13 @@
         <w:t xml:space="preserve">30</w:t>
       </w:r>
       <w:r>
-        <w:t xml:space="preserve">-candidate main list, the rank correlation (Spearman) of predicted zT with |S| is</w:t>
-      </w:r>
-      <w:r>
-        <w:t xml:space="preserve"> </w:t>
-      </w:r>
-      <w:r>
-        <w:t xml:space="preserve">0.08</w:t>
+        <w:t xml:space="preserve">-candidate main list, the rank correlation (Spearman) of predicted zT at that temperature with |S| is</w:t>
+      </w:r>
+      <w:r>
+        <w:t xml:space="preserve"> </w:t>
+      </w:r>
+      <w:r>
+        <w:t xml:space="preserve">0.06</w:t>
       </w:r>
       <w:r>
         <w:t xml:space="preserve"> </w:t>
@@ -2170,12 +2253,12 @@
           <wp:inline>
             <wp:extent cx="5334000" cy="3833812"/>
             <wp:effectExtent b="0" l="0" r="0" t="0"/>
-            <wp:docPr descr="Predicted |S| against predicted κ at the zT maximum for the main list; the number beside each point is its rank by predicted zT." title="" id="13" name="Picture"/>
+            <wp:docPr descr="Predicted |S| against predicted κ at the maximum of the predicted zT within each compound’s thermal limit (Table 11b) for the main list; the number beside each point is its position # in Table 11 (the rank by predicted zT within its cluster group). Added after the literature comparison (NA12); not pre-registered." title="" id="13" name="Picture"/>
             <a:graphic>
               <a:graphicData uri="http://schemas.openxmlformats.org/drawingml/2006/picture">
                 <pic:pic>
                   <pic:nvPicPr>
-                    <pic:cNvPr descr="../results/screening_s_kappa/20261020T042641/fig_s_kappa.png" id="14" name="Picture"/>
+                    <pic:cNvPr descr="../results/screening_s_kappa/20261020T053227/fig_s_kappa.png" id="14" name="Picture"/>
                     <pic:cNvPicPr>
                       <a:picLocks noChangeArrowheads="1" noChangeAspect="1"/>
                     </pic:cNvPicPr>
@@ -2229,7 +2312,7 @@
         <w:t xml:space="preserve"> </w:t>
       </w:r>
       <w:r>
-        <w:t xml:space="preserve">at the zT maximum for the main list; the number beside each point is its rank by predicted zT.</w:t>
+        <w:t xml:space="preserve">at the maximum of the predicted zT within each compound’s thermal limit (Table 11b) for the main list; the number beside each point is its position # in Table 11 (the rank by predicted zT within its cluster group). Added after the literature comparison (NA12); not pre-registered.</w:t>
       </w:r>
     </w:p>
     <w:p>
@@ -2241,7 +2324,7 @@
           <w:b/>
           <w:bCs/>
         </w:rPr>
-        <w:t xml:space="preserve">What it would not show.</w:t>
+        <w:t xml:space="preserve">What it does not show.</w:t>
       </w:r>
       <w:r>
         <w:t xml:space="preserve"> </w:t>
@@ -2263,7 +2346,31 @@
         <w:t xml:space="preserve"> </w:t>
       </w:r>
       <w:r>
-        <w:t xml:space="preserve">does not make a thermoelectric, so the view is a way of reading the list, not a replacement for it; every value is at the grid boundary (</w:t>
+        <w:t xml:space="preserve">does not make a thermoelectric, so the view is a way of reading the list, not a replacement for it; the values of</w:t>
+      </w:r>
+      <w:r>
+        <w:t xml:space="preserve"> </w:t>
+      </w:r>
+      <w:r>
+        <w:t xml:space="preserve">28</w:t>
+      </w:r>
+      <w:r>
+        <w:t xml:space="preserve"> </w:t>
+      </w:r>
+      <w:r>
+        <w:t xml:space="preserve">of the</w:t>
+      </w:r>
+      <w:r>
+        <w:t xml:space="preserve"> </w:t>
+      </w:r>
+      <w:r>
+        <w:t xml:space="preserve">30</w:t>
+      </w:r>
+      <w:r>
+        <w:t xml:space="preserve"> </w:t>
+      </w:r>
+      <w:r>
+        <w:t xml:space="preserve">entries are at the grid boundary (</w:t>
       </w:r>
       <w:r>
         <w:t xml:space="preserve">800</w:t>
@@ -2272,40 +2379,7 @@
         <w:t xml:space="preserve"> </w:t>
       </w:r>
       <w:r>
-        <w:t xml:space="preserve">K, the maximum of every one of the</w:t>
-      </w:r>
-      <w:r>
-        <w:t xml:space="preserve"> </w:t>
-      </w:r>
-      <w:r>
-        <w:t xml:space="preserve">30</w:t>
-      </w:r>
-      <w:r>
-        <w:t xml:space="preserve"> </w:t>
-      </w:r>
-      <w:r>
-        <w:t xml:space="preserve">main-list candidates and of</w:t>
-      </w:r>
-      <w:r>
-        <w:t xml:space="preserve"> </w:t>
-      </w:r>
-      <w:r>
-        <w:t xml:space="preserve">406</w:t>
-      </w:r>
-      <w:r>
-        <w:t xml:space="preserve"> </w:t>
-      </w:r>
-      <w:r>
-        <w:t xml:space="preserve">of</w:t>
-      </w:r>
-      <w:r>
-        <w:t xml:space="preserve"> </w:t>
-      </w:r>
-      <w:r>
-        <w:t xml:space="preserve">409</w:t>
-      </w:r>
-      <w:r>
-        <w:t xml:space="preserve">), where the training data are sparsest, so the view inherits the boundary caveat of the zT list; the sign of S is set by the classifier and was overridden for</w:t>
+        <w:t xml:space="preserve">K), where the training data are sparsest, so the view inherits the boundary caveat of the zT list; the sign of S is set by the classifier and was overridden for</w:t>
       </w:r>
       <w:r>
         <w:t xml:space="preserve"> </w:t>
@@ -2347,34 +2421,40 @@
           <w:b/>
           <w:bCs/>
         </w:rPr>
-        <w:t xml:space="preserve">Decision needed.</w:t>
-      </w:r>
-      <w:r>
-        <w:t xml:space="preserve"> </w:t>
-      </w:r>
-      <w:r>
-        <w:t xml:space="preserve">Whether to add section 5.5 and Table 11c (</w:t>
+        <w:t xml:space="preserve">Status.</w:t>
+      </w:r>
+      <w:r>
+        <w:t xml:space="preserve"> </w:t>
+      </w:r>
+      <w:r>
+        <w:t xml:space="preserve">Added to</w:t>
+      </w:r>
+      <w:r>
+        <w:t xml:space="preserve"> </w:t>
       </w:r>
       <w:r>
         <w:rPr>
           <w:rStyle w:val="VerbatimChar"/>
         </w:rPr>
-        <w:t xml:space="preserve">table11c.csv</w:t>
-      </w:r>
-      <w:r>
-        <w:t xml:space="preserve"> </w:t>
-      </w:r>
-      <w:r>
-        <w:t xml:space="preserve">in the run folder) to the paper. The preview numbers above are now generated, so they may be quoted with the label</w:t>
-      </w:r>
-      <w:r>
-        <w:t xml:space="preserve"> </w:t>
-      </w:r>
-      <w:r>
-        <w:t xml:space="preserve">“added after the literature comparison, not pre-registered”</w:t>
-      </w:r>
-      <w:r>
-        <w:t xml:space="preserve">.</w:t>
+        <w:t xml:space="preserve">paper/paper.md</w:t>
+      </w:r>
+      <w:r>
+        <w:t xml:space="preserve"> </w:t>
+      </w:r>
+      <w:r>
+        <w:t xml:space="preserve">(Section 4.5, after Table 11b: a paragraph, Figure 13 and Table 11c; the decision is recorded in</w:t>
+      </w:r>
+      <w:r>
+        <w:t xml:space="preserve"> </w:t>
+      </w:r>
+      <w:r>
+        <w:rPr>
+          <w:rStyle w:val="VerbatimChar"/>
+        </w:rPr>
+        <w:t xml:space="preserve">docs/decisions.md</w:t>
+      </w:r>
+      <w:r>
+        <w:t xml:space="preserve">, 2026-10-20). The version in the paper uses the Figure 13 and Table 11c of the run named above.</w:t>
       </w:r>
     </w:p>
     <w:bookmarkEnd w:id="15"/>

</xml_diff>